<commit_message>
Finalized SRS document, generated PDF, added references, and updated project documentation
</commit_message>
<xml_diff>
--- a/Uni/Fpage_SAFORA_SRS1_IEEE_Format_Complete.docx
+++ b/Uni/Fpage_SAFORA_SRS1_IEEE_Format_Complete.docx
@@ -55,16 +55,21 @@
     <w:p>
       <w:pPr>
         <w:jc w:val="center"/>
+        <w:rPr>
+          <w:sz w:val="28"/>
+        </w:rPr>
       </w:pPr>
       <w:r>
         <w:rPr>
           <w:b/>
-          <w:sz w:val="40"/>
+          <w:sz w:val="44"/>
         </w:rPr>
         <w:t>SAFORA (Smart Ride)</w:t>
       </w:r>
     </w:p>
     <w:p>
+      <w:bookmarkStart w:id="5" w:name="_GoBack"/>
+      <w:bookmarkEnd w:id="5"/>
       <w:r>
         <w:rPr>
           <w:noProof/>
@@ -73,10 +78,10 @@
           <wp:anchor distT="0" distB="0" distL="114300" distR="114300" simplePos="0" relativeHeight="251659264" behindDoc="0" locked="0" layoutInCell="1" allowOverlap="1" wp14:anchorId="0F89AA0E" wp14:editId="2F4D8293">
             <wp:simplePos x="0" y="0"/>
             <wp:positionH relativeFrom="column">
-              <wp:posOffset>1670576</wp:posOffset>
+              <wp:posOffset>1670050</wp:posOffset>
             </wp:positionH>
             <wp:positionV relativeFrom="paragraph">
-              <wp:posOffset>388182</wp:posOffset>
+              <wp:posOffset>292735</wp:posOffset>
             </wp:positionV>
             <wp:extent cx="2164080" cy="2200275"/>
             <wp:effectExtent l="0" t="0" r="7620" b="0"/>
@@ -95,7 +100,7 @@
                     </pic:cNvPicPr>
                   </pic:nvPicPr>
                   <pic:blipFill rotWithShape="1">
-                    <a:blip r:embed="rId6">
+                    <a:blip r:embed="rId8">
                       <a:extLst>
                         <a:ext uri="{28A0092B-C50C-407E-A947-70E740481C1C}">
                           <a14:useLocalDpi xmlns:a14="http://schemas.microsoft.com/office/drawing/2010/main" val="0"/>
@@ -260,13 +265,7 @@
         <w:rPr>
           <w:sz w:val="28"/>
         </w:rPr>
-        <w:t xml:space="preserve">1              </w:t>
-      </w:r>
-      <w:r>
-        <w:rPr>
-          <w:sz w:val="28"/>
-        </w:rPr>
-        <w:t>Mirza Umer Ikram</w:t>
+        <w:t>1              Mirza Umer Ikram</w:t>
       </w:r>
     </w:p>
     <w:p>
@@ -289,19 +288,7 @@
         <w:rPr>
           <w:sz w:val="28"/>
         </w:rPr>
-        <w:t xml:space="preserve">S3F22UBSCS088       </w:t>
-      </w:r>
-      <w:r>
-        <w:rPr>
-          <w:sz w:val="28"/>
-        </w:rPr>
-        <w:t xml:space="preserve">        </w:t>
-      </w:r>
-      <w:r>
-        <w:rPr>
-          <w:sz w:val="28"/>
-        </w:rPr>
-        <w:t>Ruhma Bilal</w:t>
+        <w:t>S3F22UBSCS088               Ruhma Bilal</w:t>
       </w:r>
       <w:r>
         <w:br/>
@@ -360,10 +347,9 @@
         </w:rPr>
         <w:t>University of Central Punjab</w:t>
       </w:r>
-      <w:bookmarkStart w:id="5" w:name="_GoBack"/>
-      <w:bookmarkEnd w:id="5"/>
     </w:p>
     <w:sectPr>
+      <w:headerReference w:type="default" r:id="rId9"/>
       <w:pgSz w:w="12240" w:h="15840"/>
       <w:pgMar w:top="1440" w:right="1800" w:bottom="1440" w:left="1800" w:header="720" w:footer="720" w:gutter="0"/>
       <w:cols w:space="720"/>
@@ -371,6 +357,81 @@
     </w:sectPr>
   </w:body>
 </w:document>
+</file>
+
+<file path=word/endnotes.xml><?xml version="1.0" encoding="utf-8"?>
+<w:endnotes xmlns:wpc="http://schemas.microsoft.com/office/word/2010/wordprocessingCanvas" xmlns:cx="http://schemas.microsoft.com/office/drawing/2014/chartex" xmlns:mc="http://schemas.openxmlformats.org/markup-compatibility/2006" xmlns:o="urn:schemas-microsoft-com:office:office" xmlns:r="http://schemas.openxmlformats.org/officeDocument/2006/relationships" xmlns:m="http://schemas.openxmlformats.org/officeDocument/2006/math" xmlns:v="urn:schemas-microsoft-com:vml" xmlns:wp14="http://schemas.microsoft.com/office/word/2010/wordprocessingDrawing" xmlns:wp="http://schemas.openxmlformats.org/drawingml/2006/wordprocessingDrawing" xmlns:w10="urn:schemas-microsoft-com:office:word" xmlns:w="http://schemas.openxmlformats.org/wordprocessingml/2006/main" xmlns:w14="http://schemas.microsoft.com/office/word/2010/wordml" xmlns:w15="http://schemas.microsoft.com/office/word/2012/wordml" xmlns:w16se="http://schemas.microsoft.com/office/word/2015/wordml/symex" xmlns:wpg="http://schemas.microsoft.com/office/word/2010/wordprocessingGroup" xmlns:wpi="http://schemas.microsoft.com/office/word/2010/wordprocessingInk" xmlns:wne="http://schemas.microsoft.com/office/word/2006/wordml" xmlns:wps="http://schemas.microsoft.com/office/word/2010/wordprocessingShape" mc:Ignorable="w14 w15 w16se wp14">
+  <w:endnote w:type="separator" w:id="-1">
+    <w:p>
+      <w:pPr>
+        <w:spacing w:after="0" w:line="240" w:lineRule="auto"/>
+      </w:pPr>
+      <w:r>
+        <w:separator/>
+      </w:r>
+    </w:p>
+  </w:endnote>
+  <w:endnote w:type="continuationSeparator" w:id="0">
+    <w:p>
+      <w:pPr>
+        <w:spacing w:after="0" w:line="240" w:lineRule="auto"/>
+      </w:pPr>
+      <w:r>
+        <w:continuationSeparator/>
+      </w:r>
+    </w:p>
+  </w:endnote>
+</w:endnotes>
+</file>
+
+<file path=word/footnotes.xml><?xml version="1.0" encoding="utf-8"?>
+<w:footnotes xmlns:wpc="http://schemas.microsoft.com/office/word/2010/wordprocessingCanvas" xmlns:cx="http://schemas.microsoft.com/office/drawing/2014/chartex" xmlns:mc="http://schemas.openxmlformats.org/markup-compatibility/2006" xmlns:o="urn:schemas-microsoft-com:office:office" xmlns:r="http://schemas.openxmlformats.org/officeDocument/2006/relationships" xmlns:m="http://schemas.openxmlformats.org/officeDocument/2006/math" xmlns:v="urn:schemas-microsoft-com:vml" xmlns:wp14="http://schemas.microsoft.com/office/word/2010/wordprocessingDrawing" xmlns:wp="http://schemas.openxmlformats.org/drawingml/2006/wordprocessingDrawing" xmlns:w10="urn:schemas-microsoft-com:office:word" xmlns:w="http://schemas.openxmlformats.org/wordprocessingml/2006/main" xmlns:w14="http://schemas.microsoft.com/office/word/2010/wordml" xmlns:w15="http://schemas.microsoft.com/office/word/2012/wordml" xmlns:w16se="http://schemas.microsoft.com/office/word/2015/wordml/symex" xmlns:wpg="http://schemas.microsoft.com/office/word/2010/wordprocessingGroup" xmlns:wpi="http://schemas.microsoft.com/office/word/2010/wordprocessingInk" xmlns:wne="http://schemas.microsoft.com/office/word/2006/wordml" xmlns:wps="http://schemas.microsoft.com/office/word/2010/wordprocessingShape" mc:Ignorable="w14 w15 w16se wp14">
+  <w:footnote w:type="separator" w:id="-1">
+    <w:p>
+      <w:pPr>
+        <w:spacing w:after="0" w:line="240" w:lineRule="auto"/>
+      </w:pPr>
+      <w:r>
+        <w:separator/>
+      </w:r>
+    </w:p>
+  </w:footnote>
+  <w:footnote w:type="continuationSeparator" w:id="0">
+    <w:p>
+      <w:pPr>
+        <w:spacing w:after="0" w:line="240" w:lineRule="auto"/>
+      </w:pPr>
+      <w:r>
+        <w:continuationSeparator/>
+      </w:r>
+    </w:p>
+  </w:footnote>
+</w:footnotes>
+</file>
+
+<file path=word/header1.xml><?xml version="1.0" encoding="utf-8"?>
+<w:hdr xmlns:wpc="http://schemas.microsoft.com/office/word/2010/wordprocessingCanvas" xmlns:cx="http://schemas.microsoft.com/office/drawing/2014/chartex" xmlns:mc="http://schemas.openxmlformats.org/markup-compatibility/2006" xmlns:o="urn:schemas-microsoft-com:office:office" xmlns:r="http://schemas.openxmlformats.org/officeDocument/2006/relationships" xmlns:m="http://schemas.openxmlformats.org/officeDocument/2006/math" xmlns:v="urn:schemas-microsoft-com:vml" xmlns:wp14="http://schemas.microsoft.com/office/word/2010/wordprocessingDrawing" xmlns:wp="http://schemas.openxmlformats.org/drawingml/2006/wordprocessingDrawing" xmlns:w10="urn:schemas-microsoft-com:office:word" xmlns:w="http://schemas.openxmlformats.org/wordprocessingml/2006/main" xmlns:w14="http://schemas.microsoft.com/office/word/2010/wordml" xmlns:w15="http://schemas.microsoft.com/office/word/2012/wordml" xmlns:w16se="http://schemas.microsoft.com/office/word/2015/wordml/symex" xmlns:wpg="http://schemas.microsoft.com/office/word/2010/wordprocessingGroup" xmlns:wpi="http://schemas.microsoft.com/office/word/2010/wordprocessingInk" xmlns:wne="http://schemas.microsoft.com/office/word/2006/wordml" xmlns:wps="http://schemas.microsoft.com/office/word/2010/wordprocessingShape" mc:Ignorable="w14 w15 w16se wp14">
+  <w:p>
+    <w:pPr>
+      <w:pStyle w:val="Footer"/>
+      <w:jc w:val="center"/>
+      <w:rPr>
+        <w:rFonts w:ascii="Arial" w:hAnsi="Arial" w:cs="Arial"/>
+      </w:rPr>
+    </w:pPr>
+    <w:r>
+      <w:rPr>
+        <w:rFonts w:ascii="Arial" w:hAnsi="Arial" w:cs="Arial"/>
+      </w:rPr>
+      <w:t>University of Central Punjab</w:t>
+    </w:r>
+  </w:p>
+  <w:p>
+    <w:pPr>
+      <w:pStyle w:val="Header"/>
+    </w:pPr>
+  </w:p>
+</w:hdr>
 </file>
 
 <file path=word/numbering.xml><?xml version="1.0" encoding="utf-8"?>
@@ -626,7 +687,7 @@
     <w:lsdException w:name="footnote text" w:semiHidden="1" w:unhideWhenUsed="1"/>
     <w:lsdException w:name="annotation text" w:semiHidden="1" w:unhideWhenUsed="1"/>
     <w:lsdException w:name="header" w:semiHidden="1" w:unhideWhenUsed="1"/>
-    <w:lsdException w:name="footer" w:semiHidden="1" w:unhideWhenUsed="1"/>
+    <w:lsdException w:name="footer" w:semiHidden="1" w:uiPriority="0" w:unhideWhenUsed="1"/>
     <w:lsdException w:name="index heading" w:semiHidden="1" w:unhideWhenUsed="1"/>
     <w:lsdException w:name="caption" w:semiHidden="1" w:uiPriority="35" w:unhideWhenUsed="1" w:qFormat="1"/>
     <w:lsdException w:name="table of figures" w:semiHidden="1" w:unhideWhenUsed="1"/>
@@ -1228,7 +1289,6 @@
     <w:name w:val="footer"/>
     <w:basedOn w:val="Normal"/>
     <w:link w:val="FooterChar"/>
-    <w:uiPriority w:val="99"/>
     <w:unhideWhenUsed/>
     <w:rsid w:val="00E618BF"/>
     <w:pPr>
@@ -1243,7 +1303,6 @@
     <w:name w:val="Footer Char"/>
     <w:basedOn w:val="DefaultParagraphFont"/>
     <w:link w:val="Footer"/>
-    <w:uiPriority w:val="99"/>
     <w:rsid w:val="00E618BF"/>
   </w:style>
   <w:style w:type="paragraph" w:styleId="NoSpacing">
@@ -12282,7 +12341,7 @@
 </file>
 
 <file path=customXml/itemProps1.xml><?xml version="1.0" encoding="utf-8"?>
-<ds:datastoreItem xmlns:ds="http://schemas.openxmlformats.org/officeDocument/2006/customXml" ds:itemID="{A7B07EED-89B3-49A9-AB7B-502F0901492B}">
+<ds:datastoreItem xmlns:ds="http://schemas.openxmlformats.org/officeDocument/2006/customXml" ds:itemID="{9C30BFD9-0E7E-4526-BDC6-BB352682267F}">
   <ds:schemaRefs>
     <ds:schemaRef ds:uri="http://schemas.openxmlformats.org/officeDocument/2006/bibliography"/>
   </ds:schemaRefs>

</xml_diff>